<commit_message>
atelier: rendre chaque atelier autonome — suppression des renvois #NN (parenthèses + tags), réinjection du concept via l'index où #N est un nom ; renvoi_/checklist_/modules intouchés ; index #98 corrigé
</commit_message>
<xml_diff>
--- a/atelier/atelier_007.docx
+++ b/atelier/atelier_007.docx
@@ -445,7 +445,7 @@
           </w:tcPr>
           <w:p>
             <w:r>
-              <w:t xml:space="preserve">Inventaire outillage réalisé (atelier #6)</w:t>
+              <w:t xml:space="preserve">Inventaire outillage réalisé</w:t>
             </w:r>
           </w:p>
         </w:tc>
@@ -464,7 +464,7 @@
         <w:spacing w:after="120"/>
       </w:pPr>
       <w:r>
-        <w:t xml:space="preserve">L'inventaire (atelier #6) a montré les doublons : deux outils pour la doc, des décisions éparpillées entre Teams et Jira, des demandes qui arrivent par trois canaux. Maintenant il faut trancher : pour chaque type d'usage, UN outil de référence. Le sujet n'est pas de bannir des outils mais de désigner, par usage, la source de vérité — et surtout de faire tenir cette convention dans le temps. La difficulté n'est pas technique, elle est sociale : chacun a ses habitudes, et une convention que personne n'applique ne vaut rien. Le sujet : pourquoi « un outil par usage » réduit la friction, et comment décider sans que ça reste lettre morte.</w:t>
+        <w:t xml:space="preserve">L'inventaire a montré les doublons : deux outils pour la doc, des décisions éparpillées entre Teams et Jira, des demandes qui arrivent par trois canaux. Maintenant il faut trancher : pour chaque type d'usage, UN outil de référence. Le sujet n'est pas de bannir des outils mais de désigner, par usage, la source de vérité — et surtout de faire tenir cette convention dans le temps. La difficulté n'est pas technique, elle est sociale : chacun a ses habitudes, et une convention que personne n'applique ne vaut rien. Le sujet : pourquoi « un outil par usage » réduit la friction, et comment décider sans que ça reste lettre morte.</w:t>
       </w:r>
     </w:p>
     <w:p>
@@ -659,7 +659,7 @@
         </w:numPr>
       </w:pPr>
       <w:r>
-        <w:t xml:space="preserve">Capsule de vote — pour trancher les cases où plusieurs outils étaient en doublon (issues de l'inventaire #6).</w:t>
+        <w:t xml:space="preserve">Capsule de vote — pour trancher les cases où plusieurs outils étaient en doublon (issues de l'inventaire).</w:t>
       </w:r>
     </w:p>
     <w:p>
@@ -691,7 +691,7 @@
         </w:numPr>
       </w:pPr>
       <w:r>
-        <w:t xml:space="preserve">(5 min) Cadrage — l'animateur rappelle les doublons de l'inventaire #6 et pose la règle : un outil par usage, on tranche par usage pas par outil.</w:t>
+        <w:t xml:space="preserve">(5 min) Cadrage — l'animateur rappelle les doublons de l'inventaire et pose la règle : un outil par usage, on tranche par usage pas par outil.</w:t>
       </w:r>
     </w:p>
     <w:p>

</xml_diff>